<commit_message>
Cite the Zenodo archive, and correct the commit identity
The archive exists: concept DOI 10.5281/zenodo.22726726, which always resolves
to the latest version, and 10.5281/zenodo.22726727 for v1.0.0. The manuscript's
Data Availability section now carries the concept DOI, and it is the default in
fk_fill_manuscript so the pipeline reproduces the document without arguments.

The two earlier commits were authored under the wrong account name and have
been rewritten to dulianzeqiraj. Done before any archive existed, so nothing
deposited refers to a commit that has since disappeared.
</commit_message>
<xml_diff>
--- a/manuscript/Zeqiraj_FusheKuqe_OED_manuscript.docx
+++ b/manuscript/Zeqiraj_FusheKuqe_OED_manuscript.docx
@@ -6023,7 +6023,7 @@
         </w:numPr>
       </w:pPr>
       <w:r>
-        <w:t xml:space="preserve">Zenodo (archived release): https://doi.org/10.5281/zenodo.PLACEHOLDER</w:t>
+        <w:t xml:space="preserve">Zenodo (archived release): https://doi.org/10.5281/zenodo.22726726</w:t>
       </w:r>
     </w:p>
     <w:p>
@@ -7181,7 +7181,7 @@
               <w:pStyle w:val="Compact"/>
             </w:pPr>
             <w:r>
-              <w:t xml:space="preserve">363</w:t>
+              <w:t xml:space="preserve">367</w:t>
             </w:r>
           </w:p>
         </w:tc>
@@ -7195,7 +7195,7 @@
               <w:rPr>
                 <w:rStyle w:val="VerbatimChar"/>
               </w:rPr>
-              <w:t xml:space="preserve">4ecaff890d0ead90</w:t>
+              <w:t xml:space="preserve">4825be3ee4e50d15</w:t>
             </w:r>
           </w:p>
         </w:tc>
@@ -29989,6 +29989,42 @@
         <w:rPr>
           <w:rStyle w:val="VerbatimChar"/>
         </w:rPr>
+        <w:t xml:space="preserve">%  The Zenodo default is the concept DOI, which always resolves to the latest</w:t>
+      </w:r>
+      <w:r>
+        <w:br/>
+      </w:r>
+      <w:r>
+        <w:rPr>
+          <w:rStyle w:val="VerbatimChar"/>
+        </w:rPr>
+        <w:t xml:space="preserve">%  archived version, rather than a version DOI, which would pin the paper to</w:t>
+      </w:r>
+      <w:r>
+        <w:br/>
+      </w:r>
+      <w:r>
+        <w:rPr>
+          <w:rStyle w:val="VerbatimChar"/>
+        </w:rPr>
+        <w:t xml:space="preserve">%  an archive made before the paper itself carried the DOI.</w:t>
+      </w:r>
+      <w:r>
+        <w:br/>
+      </w:r>
+      <w:r>
+        <w:rPr>
+          <w:rStyle w:val="VerbatimChar"/>
+        </w:rPr>
+        <w:t xml:space="preserve">%</w:t>
+      </w:r>
+      <w:r>
+        <w:br/>
+      </w:r>
+      <w:r>
+        <w:rPr>
+          <w:rStyle w:val="VerbatimChar"/>
+        </w:rPr>
         <w:t xml:space="preserve">%  Substitutes every {{placeholder}} in manuscript/manuscript.md with a value</w:t>
       </w:r>
       <w:r>
@@ -30205,7 +30241,7 @@
         <w:rPr>
           <w:rStyle w:val="VerbatimChar"/>
         </w:rPr>
-        <w:t xml:space="preserve">    zenodo_doi = 'https://doi.org/10.5281/zenodo.PLACEHOLDER';</w:t>
+        <w:t xml:space="preserve">    zenodo_doi = 'https://doi.org/10.5281/zenodo.22726726';</w:t>
       </w:r>
       <w:r>
         <w:br/>

</xml_diff>

<commit_message>
Embed the figures in the document
The earlier builds carried the eight captions and none of the figures, and
nothing in the document said so: the captions read normally and the table and
equation counts were right, so every check passed.

fk_md2docx now understands image syntax and writes the drawing markup, adds
the image parts, amends the relationships and declares the PNG content type.
fk_png_size reads the dimensions so each figure is set to the text measure
with its aspect preserved. fk_zip_write replaces the single-part writer so
parts can be added as well as replaced. fk_verify_docx counts pictures against
captions and fails if a caption has none.

The figures sit before the references, since after them the document carries
nothing but the MATLAB listings.
</commit_message>
<xml_diff>
--- a/manuscript/Zeqiraj_FusheKuqe_OED_manuscript.docx
+++ b/manuscript/Zeqiraj_FusheKuqe_OED_manuscript.docx
@@ -1,6 +1,6 @@
 
 <file path=word/document.xml><?xml version="1.0" encoding="utf-8"?>
-<w:document xmlns:w="http://schemas.openxmlformats.org/wordprocessingml/2006/main" xmlns:m="http://schemas.openxmlformats.org/officeDocument/2006/math" xmlns:r="http://schemas.openxmlformats.org/officeDocument/2006/relationships">
+<w:document xmlns:w="http://schemas.openxmlformats.org/wordprocessingml/2006/main" xmlns:m="http://schemas.openxmlformats.org/officeDocument/2006/math" xmlns:r="http://schemas.openxmlformats.org/officeDocument/2006/relationships" xmlns:wp="http://schemas.openxmlformats.org/drawingml/2006/wordprocessingDrawing" xmlns:a="http://schemas.openxmlformats.org/drawingml/2006/main" xmlns:pic="http://schemas.openxmlformats.org/drawingml/2006/picture">
   <w:body>
     <w:p>
       <w:pPr>
@@ -6071,12 +6071,55 @@
         <w:pStyle w:val="Heading2"/>
       </w:pPr>
       <w:r>
-        <w:t xml:space="preserve">Figure captions</w:t>
+        <w:t xml:space="preserve">Figures</w:t>
       </w:r>
     </w:p>
     <w:p>
       <w:pPr>
-        <w:pStyle w:val="FirstParagraph"/>
+        <w:pStyle w:val="Compact"/>
+        <w:jc w:val="center"/>
+      </w:pPr>
+      <w:r>
+        <w:drawing>
+          <wp:inline distT="0" distB="0" distL="0" distR="0">
+            <wp:extent cx="6104763" cy="3213534"/>
+            <wp:effectExtent l="0" t="0" r="0" b="0"/>
+            <wp:docPr id="1001" name="Picture 1001" descr="Figure 1"/>
+            <wp:cNvGraphicFramePr>
+              <a:graphicFrameLocks noChangeAspect="1"/>
+            </wp:cNvGraphicFramePr>
+            <a:graphic>
+              <a:graphicData uri="http://schemas.openxmlformats.org/drawingml/2006/picture">
+                <pic:pic>
+                  <pic:nvPicPr>
+                    <pic:cNvPr id="1001" name="Picture 1001"/>
+                    <pic:cNvPicPr/>
+                  </pic:nvPicPr>
+                  <pic:blipFill>
+                    <a:blip r:embed="rIdFig1"/>
+                    <a:stretch>
+                      <a:fillRect/>
+                    </a:stretch>
+                  </pic:blipFill>
+                  <pic:spPr>
+                    <a:xfrm>
+                      <a:off x="0" y="0"/>
+                      <a:ext cx="6104763" cy="3213534"/>
+                    </a:xfrm>
+                    <a:prstGeom prst="rect">
+                      <a:avLst/>
+                    </a:prstGeom>
+                  </pic:spPr>
+                </pic:pic>
+              </a:graphicData>
+            </a:graphic>
+          </wp:inline>
+        </w:drawing>
+      </w:r>
+    </w:p>
+    <w:p>
+      <w:pPr>
+        <w:pStyle w:val="BodyText"/>
       </w:pPr>
       <w:r>
         <w:rPr>
@@ -6119,6 +6162,49 @@
     </w:p>
     <w:p>
       <w:pPr>
+        <w:pStyle w:val="Compact"/>
+        <w:jc w:val="center"/>
+      </w:pPr>
+      <w:r>
+        <w:drawing>
+          <wp:inline distT="0" distB="0" distL="0" distR="0">
+            <wp:extent cx="6104763" cy="2409811"/>
+            <wp:effectExtent l="0" t="0" r="0" b="0"/>
+            <wp:docPr id="1002" name="Picture 1002" descr="Figure 2"/>
+            <wp:cNvGraphicFramePr>
+              <a:graphicFrameLocks noChangeAspect="1"/>
+            </wp:cNvGraphicFramePr>
+            <a:graphic>
+              <a:graphicData uri="http://schemas.openxmlformats.org/drawingml/2006/picture">
+                <pic:pic>
+                  <pic:nvPicPr>
+                    <pic:cNvPr id="1002" name="Picture 1002"/>
+                    <pic:cNvPicPr/>
+                  </pic:nvPicPr>
+                  <pic:blipFill>
+                    <a:blip r:embed="rIdFig2"/>
+                    <a:stretch>
+                      <a:fillRect/>
+                    </a:stretch>
+                  </pic:blipFill>
+                  <pic:spPr>
+                    <a:xfrm>
+                      <a:off x="0" y="0"/>
+                      <a:ext cx="6104763" cy="2409811"/>
+                    </a:xfrm>
+                    <a:prstGeom prst="rect">
+                      <a:avLst/>
+                    </a:prstGeom>
+                  </pic:spPr>
+                </pic:pic>
+              </a:graphicData>
+            </a:graphic>
+          </wp:inline>
+        </w:drawing>
+      </w:r>
+    </w:p>
+    <w:p>
+      <w:pPr>
         <w:pStyle w:val="BodyText"/>
       </w:pPr>
       <w:r>
@@ -6146,6 +6232,49 @@
       </m:oMath>
       <w:r>
         <w:t xml:space="preserve"> for every method tested, against the network-mean baseline at zero. (b) Modelled against observed nitrate, in sample and under leave-one-out, with the 1:1 line.</w:t>
+      </w:r>
+    </w:p>
+    <w:p>
+      <w:pPr>
+        <w:pStyle w:val="Compact"/>
+        <w:jc w:val="center"/>
+      </w:pPr>
+      <w:r>
+        <w:drawing>
+          <wp:inline distT="0" distB="0" distL="0" distR="0">
+            <wp:extent cx="6104763" cy="2249338"/>
+            <wp:effectExtent l="0" t="0" r="0" b="0"/>
+            <wp:docPr id="1003" name="Picture 1003" descr="Figure 3"/>
+            <wp:cNvGraphicFramePr>
+              <a:graphicFrameLocks noChangeAspect="1"/>
+            </wp:cNvGraphicFramePr>
+            <a:graphic>
+              <a:graphicData uri="http://schemas.openxmlformats.org/drawingml/2006/picture">
+                <pic:pic>
+                  <pic:nvPicPr>
+                    <pic:cNvPr id="1003" name="Picture 1003"/>
+                    <pic:cNvPicPr/>
+                  </pic:nvPicPr>
+                  <pic:blipFill>
+                    <a:blip r:embed="rIdFig3"/>
+                    <a:stretch>
+                      <a:fillRect/>
+                    </a:stretch>
+                  </pic:blipFill>
+                  <pic:spPr>
+                    <a:xfrm>
+                      <a:off x="0" y="0"/>
+                      <a:ext cx="6104763" cy="2249338"/>
+                    </a:xfrm>
+                    <a:prstGeom prst="rect">
+                      <a:avLst/>
+                    </a:prstGeom>
+                  </pic:spPr>
+                </pic:pic>
+              </a:graphicData>
+            </a:graphic>
+          </wp:inline>
+        </w:drawing>
       </w:r>
     </w:p>
     <w:p>
@@ -6193,16 +6322,45 @@
     </w:p>
     <w:p>
       <w:pPr>
-        <w:pStyle w:val="BodyText"/>
+        <w:pStyle w:val="Compact"/>
+        <w:jc w:val="center"/>
       </w:pPr>
       <w:r>
-        <w:rPr>
-          <w:b/>
-        </w:rPr>
-        <w:t xml:space="preserve">Figure 4.</w:t>
-      </w:r>
-      <w:r>
-        <w:t xml:space="preserve"> What the existing network buys. (a) Modelled nitrate at the fitted onset time. (b) Prior standard deviation of effective porosity. (c) The reduction in that standard deviation produced by assimilating all 24 nitrate observations, on the same colour scale.</w:t>
+        <w:drawing>
+          <wp:inline distT="0" distB="0" distL="0" distR="0">
+            <wp:extent cx="6104763" cy="2249338"/>
+            <wp:effectExtent l="0" t="0" r="0" b="0"/>
+            <wp:docPr id="1004" name="Picture 1004" descr="Figure 4"/>
+            <wp:cNvGraphicFramePr>
+              <a:graphicFrameLocks noChangeAspect="1"/>
+            </wp:cNvGraphicFramePr>
+            <a:graphic>
+              <a:graphicData uri="http://schemas.openxmlformats.org/drawingml/2006/picture">
+                <pic:pic>
+                  <pic:nvPicPr>
+                    <pic:cNvPr id="1004" name="Picture 1004"/>
+                    <pic:cNvPicPr/>
+                  </pic:nvPicPr>
+                  <pic:blipFill>
+                    <a:blip r:embed="rIdFig4"/>
+                    <a:stretch>
+                      <a:fillRect/>
+                    </a:stretch>
+                  </pic:blipFill>
+                  <pic:spPr>
+                    <a:xfrm>
+                      <a:off x="0" y="0"/>
+                      <a:ext cx="6104763" cy="2249338"/>
+                    </a:xfrm>
+                    <a:prstGeom prst="rect">
+                      <a:avLst/>
+                    </a:prstGeom>
+                  </pic:spPr>
+                </pic:pic>
+              </a:graphicData>
+            </a:graphic>
+          </wp:inline>
+        </w:drawing>
       </w:r>
     </w:p>
     <w:p>
@@ -6213,10 +6371,53 @@
         <w:rPr>
           <w:b/>
         </w:rPr>
-        <w:t xml:space="preserve">Figure 5.</w:t>
-      </w:r>
-      <w:r>
-        <w:t xml:space="preserve"> Design with transport observations. (a) The one-shot variance gain, with the sites the unconstrained greedy sequence returns: 5 wells within 283 m. (b) The two criteria under a minimum separation of 2057 m, over the vulnerability field. (c) The standard deviation of the vulnerability-weighted arrival time against the number of wells added.</w:t>
+        <w:t xml:space="preserve">Figure 4.</w:t>
+      </w:r>
+      <w:r>
+        <w:t xml:space="preserve"> What the existing network buys. (a) Modelled nitrate at the fitted onset time. (b) Prior standard deviation of effective porosity. (c) The reduction in that standard deviation produced by assimilating all 24 nitrate observations, on the same colour scale.</w:t>
+      </w:r>
+    </w:p>
+    <w:p>
+      <w:pPr>
+        <w:pStyle w:val="Compact"/>
+        <w:jc w:val="center"/>
+      </w:pPr>
+      <w:r>
+        <w:drawing>
+          <wp:inline distT="0" distB="0" distL="0" distR="0">
+            <wp:extent cx="6104763" cy="2891229"/>
+            <wp:effectExtent l="0" t="0" r="0" b="0"/>
+            <wp:docPr id="1005" name="Picture 1005" descr="Figure 5"/>
+            <wp:cNvGraphicFramePr>
+              <a:graphicFrameLocks noChangeAspect="1"/>
+            </wp:cNvGraphicFramePr>
+            <a:graphic>
+              <a:graphicData uri="http://schemas.openxmlformats.org/drawingml/2006/picture">
+                <pic:pic>
+                  <pic:nvPicPr>
+                    <pic:cNvPr id="1005" name="Picture 1005"/>
+                    <pic:cNvPicPr/>
+                  </pic:nvPicPr>
+                  <pic:blipFill>
+                    <a:blip r:embed="rIdFig5"/>
+                    <a:stretch>
+                      <a:fillRect/>
+                    </a:stretch>
+                  </pic:blipFill>
+                  <pic:spPr>
+                    <a:xfrm>
+                      <a:off x="0" y="0"/>
+                      <a:ext cx="6104763" cy="2891229"/>
+                    </a:xfrm>
+                    <a:prstGeom prst="rect">
+                      <a:avLst/>
+                    </a:prstGeom>
+                  </pic:spPr>
+                </pic:pic>
+              </a:graphicData>
+            </a:graphic>
+          </wp:inline>
+        </w:drawing>
       </w:r>
     </w:p>
     <w:p>
@@ -6227,10 +6428,53 @@
         <w:rPr>
           <w:b/>
         </w:rPr>
-        <w:t xml:space="preserve">Figure 6.</w:t>
-      </w:r>
-      <w:r>
-        <w:t xml:space="preserve"> Design with characterisation points, where the criterion matters. (a) The two designs at Fushë-Kuqe over the vulnerability field. (b) Variance of the goal functional relative to its prior value, at both sites and under both criteria. (c) The 44 USGS wells of the Mississippi Alluvial Plain with the two designs.</w:t>
+        <w:t xml:space="preserve">Figure 5.</w:t>
+      </w:r>
+      <w:r>
+        <w:t xml:space="preserve"> Design with transport observations. (a) The one-shot variance gain, with the sites the unconstrained greedy sequence returns: 5 wells within 283 m. (b) The two criteria under a minimum separation of 2057 m, over the vulnerability field. (c) The standard deviation of the vulnerability-weighted arrival time against the number of wells added.</w:t>
+      </w:r>
+    </w:p>
+    <w:p>
+      <w:pPr>
+        <w:pStyle w:val="Compact"/>
+        <w:jc w:val="center"/>
+      </w:pPr>
+      <w:r>
+        <w:drawing>
+          <wp:inline distT="0" distB="0" distL="0" distR="0">
+            <wp:extent cx="6104763" cy="2891229"/>
+            <wp:effectExtent l="0" t="0" r="0" b="0"/>
+            <wp:docPr id="1006" name="Picture 1006" descr="Figure 6"/>
+            <wp:cNvGraphicFramePr>
+              <a:graphicFrameLocks noChangeAspect="1"/>
+            </wp:cNvGraphicFramePr>
+            <a:graphic>
+              <a:graphicData uri="http://schemas.openxmlformats.org/drawingml/2006/picture">
+                <pic:pic>
+                  <pic:nvPicPr>
+                    <pic:cNvPr id="1006" name="Picture 1006"/>
+                    <pic:cNvPicPr/>
+                  </pic:nvPicPr>
+                  <pic:blipFill>
+                    <a:blip r:embed="rIdFig6"/>
+                    <a:stretch>
+                      <a:fillRect/>
+                    </a:stretch>
+                  </pic:blipFill>
+                  <pic:spPr>
+                    <a:xfrm>
+                      <a:off x="0" y="0"/>
+                      <a:ext cx="6104763" cy="2891229"/>
+                    </a:xfrm>
+                    <a:prstGeom prst="rect">
+                      <a:avLst/>
+                    </a:prstGeom>
+                  </pic:spPr>
+                </pic:pic>
+              </a:graphicData>
+            </a:graphic>
+          </wp:inline>
+        </w:drawing>
       </w:r>
     </w:p>
     <w:p>
@@ -6241,10 +6485,110 @@
         <w:rPr>
           <w:b/>
         </w:rPr>
+        <w:t xml:space="preserve">Figure 6.</w:t>
+      </w:r>
+      <w:r>
+        <w:t xml:space="preserve"> Design with characterisation points, where the criterion matters. (a) The two designs at Fushë-Kuqe over the vulnerability field. (b) Variance of the goal functional relative to its prior value, at both sites and under both criteria. (c) The 44 USGS wells of the Mississippi Alluvial Plain with the two designs.</w:t>
+      </w:r>
+    </w:p>
+    <w:p>
+      <w:pPr>
+        <w:pStyle w:val="Compact"/>
+        <w:jc w:val="center"/>
+      </w:pPr>
+      <w:r>
+        <w:drawing>
+          <wp:inline distT="0" distB="0" distL="0" distR="0">
+            <wp:extent cx="6104763" cy="2088865"/>
+            <wp:effectExtent l="0" t="0" r="0" b="0"/>
+            <wp:docPr id="1007" name="Picture 1007" descr="Figure 7"/>
+            <wp:cNvGraphicFramePr>
+              <a:graphicFrameLocks noChangeAspect="1"/>
+            </wp:cNvGraphicFramePr>
+            <a:graphic>
+              <a:graphicData uri="http://schemas.openxmlformats.org/drawingml/2006/picture">
+                <pic:pic>
+                  <pic:nvPicPr>
+                    <pic:cNvPr id="1007" name="Picture 1007"/>
+                    <pic:cNvPicPr/>
+                  </pic:nvPicPr>
+                  <pic:blipFill>
+                    <a:blip r:embed="rIdFig7"/>
+                    <a:stretch>
+                      <a:fillRect/>
+                    </a:stretch>
+                  </pic:blipFill>
+                  <pic:spPr>
+                    <a:xfrm>
+                      <a:off x="0" y="0"/>
+                      <a:ext cx="6104763" cy="2088865"/>
+                    </a:xfrm>
+                    <a:prstGeom prst="rect">
+                      <a:avLst/>
+                    </a:prstGeom>
+                  </pic:spPr>
+                </pic:pic>
+              </a:graphicData>
+            </a:graphic>
+          </wp:inline>
+        </w:drawing>
+      </w:r>
+    </w:p>
+    <w:p>
+      <w:pPr>
+        <w:pStyle w:val="BodyText"/>
+      </w:pPr>
+      <w:r>
+        <w:rPr>
+          <w:b/>
+        </w:rPr>
         <w:t xml:space="preserve">Figure 7.</w:t>
       </w:r>
       <w:r>
         <w:t xml:space="preserve"> Sampling and sensitivity. (a) Normalised effective sample size for implicit sampling and for sequential importance resampling from the prior. (b) The information-equivalence factor against nitrate measurement error, with unity marked. (c) The same against longitudinal dispersivity. (d) Median separation of the two designs and the goal-oriented advantage against the vulnerability exponent.</w:t>
+      </w:r>
+    </w:p>
+    <w:p>
+      <w:pPr>
+        <w:pStyle w:val="Compact"/>
+        <w:jc w:val="center"/>
+      </w:pPr>
+      <w:r>
+        <w:drawing>
+          <wp:inline distT="0" distB="0" distL="0" distR="0">
+            <wp:extent cx="6104763" cy="2432579"/>
+            <wp:effectExtent l="0" t="0" r="0" b="0"/>
+            <wp:docPr id="1008" name="Picture 1008" descr="Graphical abstract"/>
+            <wp:cNvGraphicFramePr>
+              <a:graphicFrameLocks noChangeAspect="1"/>
+            </wp:cNvGraphicFramePr>
+            <a:graphic>
+              <a:graphicData uri="http://schemas.openxmlformats.org/drawingml/2006/picture">
+                <pic:pic>
+                  <pic:nvPicPr>
+                    <pic:cNvPr id="1008" name="Picture 1008"/>
+                    <pic:cNvPicPr/>
+                  </pic:nvPicPr>
+                  <pic:blipFill>
+                    <a:blip r:embed="rIdFig8"/>
+                    <a:stretch>
+                      <a:fillRect/>
+                    </a:stretch>
+                  </pic:blipFill>
+                  <pic:spPr>
+                    <a:xfrm>
+                      <a:off x="0" y="0"/>
+                      <a:ext cx="6104763" cy="2432579"/>
+                    </a:xfrm>
+                    <a:prstGeom prst="rect">
+                      <a:avLst/>
+                    </a:prstGeom>
+                  </pic:spPr>
+                </pic:pic>
+              </a:graphicData>
+            </a:graphic>
+          </wp:inline>
+        </w:drawing>
       </w:r>
     </w:p>
     <w:p>
@@ -7345,7 +7689,7 @@
               <w:pStyle w:val="Compact"/>
             </w:pPr>
             <w:r>
-              <w:t xml:space="preserve">305</w:t>
+              <w:t xml:space="preserve">444</w:t>
             </w:r>
           </w:p>
         </w:tc>
@@ -7359,7 +7703,7 @@
               <w:rPr>
                 <w:rStyle w:val="VerbatimChar"/>
               </w:rPr>
-              <w:t xml:space="preserve">0c7fb33ead18c453</w:t>
+              <w:t xml:space="preserve">6028f47dc38df9cd</w:t>
             </w:r>
           </w:p>
         </w:tc>
@@ -7509,7 +7853,7 @@
               <w:pStyle w:val="Compact"/>
             </w:pPr>
             <w:r>
-              <w:t xml:space="preserve">150</w:t>
+              <w:t xml:space="preserve">174</w:t>
             </w:r>
           </w:p>
         </w:tc>
@@ -7523,7 +7867,7 @@
               <w:rPr>
                 <w:rStyle w:val="VerbatimChar"/>
               </w:rPr>
-              <w:t xml:space="preserve">afd10246b7fd16b2</w:t>
+              <w:t xml:space="preserve">ea67a358f81c7103</w:t>
             </w:r>
           </w:p>
         </w:tc>
@@ -37163,16 +37507,16 @@
         <w:rPr>
           <w:rStyle w:val="VerbatimChar"/>
         </w:rPr>
-        <w:t xml:space="preserve">%  code blocks, bold and code spans, and inline and display mathematics, the</w:t>
-      </w:r>
-      <w:r>
-        <w:br/>
-      </w:r>
-      <w:r>
-        <w:rPr>
-          <w:rStyle w:val="VerbatimChar"/>
-        </w:rPr>
-        <w:t xml:space="preserve">%  last through fk_latex2omml.</w:t>
+        <w:t xml:space="preserve">%  code blocks, bold, italic and code spans, images, and inline and display</w:t>
+      </w:r>
+      <w:r>
+        <w:br/>
+      </w:r>
+      <w:r>
+        <w:rPr>
+          <w:rStyle w:val="VerbatimChar"/>
+        </w:rPr>
+        <w:t xml:space="preserve">%  mathematics, the last through fk_latex2omml.</w:t>
       </w:r>
       <w:r>
         <w:br/>
@@ -37190,34 +37534,52 @@
         <w:rPr>
           <w:rStyle w:val="VerbatimChar"/>
         </w:rPr>
-        <w:t xml:space="preserve">%  The template supplies every part of the package except word/document.xml:</w:t>
-      </w:r>
-      <w:r>
-        <w:br/>
-      </w:r>
-      <w:r>
-        <w:rPr>
-          <w:rStyle w:val="VerbatimChar"/>
-        </w:rPr>
-        <w:t xml:space="preserve">%  styles, numbering, theme, fonts, section setup.  Only the body is written</w:t>
-      </w:r>
-      <w:r>
-        <w:br/>
-      </w:r>
-      <w:r>
-        <w:rPr>
-          <w:rStyle w:val="VerbatimChar"/>
-        </w:rPr>
-        <w:t xml:space="preserve">%  here, which is the same discipline used elsewhere in this project for</w:t>
-      </w:r>
-      <w:r>
-        <w:br/>
-      </w:r>
-      <w:r>
-        <w:rPr>
-          <w:rStyle w:val="VerbatimChar"/>
-        </w:rPr>
-        <w:t xml:space="preserve">%  editing a Word file without rebuilding it.</w:t>
+        <w:t xml:space="preserve">%  The template supplies every part of the package except the ones written</w:t>
+      </w:r>
+      <w:r>
+        <w:br/>
+      </w:r>
+      <w:r>
+        <w:rPr>
+          <w:rStyle w:val="VerbatimChar"/>
+        </w:rPr>
+        <w:t xml:space="preserve">%  here: styles, numbering, theme, fonts, section setup.  The body is</w:t>
+      </w:r>
+      <w:r>
+        <w:br/>
+      </w:r>
+      <w:r>
+        <w:rPr>
+          <w:rStyle w:val="VerbatimChar"/>
+        </w:rPr>
+        <w:t xml:space="preserve">%  written, the image parts are added, and the relationship and content-type</w:t>
+      </w:r>
+      <w:r>
+        <w:br/>
+      </w:r>
+      <w:r>
+        <w:rPr>
+          <w:rStyle w:val="VerbatimChar"/>
+        </w:rPr>
+        <w:t xml:space="preserve">%  parts are amended to declare them.  Everything else is carried across</w:t>
+      </w:r>
+      <w:r>
+        <w:br/>
+      </w:r>
+      <w:r>
+        <w:rPr>
+          <w:rStyle w:val="VerbatimChar"/>
+        </w:rPr>
+        <w:t xml:space="preserve">%  untouched, which is the discipline this project uses for editing a Word</w:t>
+      </w:r>
+      <w:r>
+        <w:br/>
+      </w:r>
+      <w:r>
+        <w:rPr>
+          <w:rStyle w:val="VerbatimChar"/>
+        </w:rPr>
+        <w:t xml:space="preserve">%  file rather than rebuilding it.</w:t>
       </w:r>
       <w:r>
         <w:br/>
@@ -37289,6 +37651,33 @@
         <w:rPr>
           <w:rStyle w:val="VerbatimChar"/>
         </w:rPr>
+        <w:t xml:space="preserve">WP  = 'xmlns:wp="http://schemas.openxmlformats.org/drawingml/2006/wordprocessingDrawing"';</w:t>
+      </w:r>
+      <w:r>
+        <w:br/>
+      </w:r>
+      <w:r>
+        <w:rPr>
+          <w:rStyle w:val="VerbatimChar"/>
+        </w:rPr>
+        <w:t xml:space="preserve">A   = 'xmlns:a="http://schemas.openxmlformats.org/drawingml/2006/main"';</w:t>
+      </w:r>
+      <w:r>
+        <w:br/>
+      </w:r>
+      <w:r>
+        <w:rPr>
+          <w:rStyle w:val="VerbatimChar"/>
+        </w:rPr>
+        <w:t xml:space="preserve">PIC = 'xmlns:pic="http://schemas.openxmlformats.org/drawingml/2006/picture"';</w:t>
+      </w:r>
+      <w:r>
+        <w:br/>
+      </w:r>
+      <w:r>
+        <w:rPr>
+          <w:rStyle w:val="VerbatimChar"/>
+        </w:rPr>
         <w:t xml:space="preserve"/>
       </w:r>
       <w:r>
@@ -37298,6 +37687,51 @@
         <w:rPr>
           <w:rStyle w:val="VerbatimChar"/>
         </w:rPr>
+        <w:t xml:space="preserve">% Text width of the template's page, in EMU, so a figure is set to the</w:t>
+      </w:r>
+      <w:r>
+        <w:br/>
+      </w:r>
+      <w:r>
+        <w:rPr>
+          <w:rStyle w:val="VerbatimChar"/>
+        </w:rPr>
+        <w:t xml:space="preserve">% measure rather than to a guess.  One twip is 635 EMU.</w:t>
+      </w:r>
+      <w:r>
+        <w:br/>
+      </w:r>
+      <w:r>
+        <w:rPr>
+          <w:rStyle w:val="VerbatimChar"/>
+        </w:rPr>
+        <w:t xml:space="preserve">emu_width = local_textwidth(template);</w:t>
+      </w:r>
+      <w:r>
+        <w:br/>
+      </w:r>
+      <w:r>
+        <w:rPr>
+          <w:rStyle w:val="VerbatimChar"/>
+        </w:rPr>
+        <w:t xml:space="preserve">images = struct('path', {}, 'part', {}, 'rid', {}, 'cx', {}, 'cy', {}, 'alt', {});</w:t>
+      </w:r>
+      <w:r>
+        <w:br/>
+      </w:r>
+      <w:r>
+        <w:rPr>
+          <w:rStyle w:val="VerbatimChar"/>
+        </w:rPr>
+        <w:t xml:space="preserve"/>
+      </w:r>
+      <w:r>
+        <w:br/>
+      </w:r>
+      <w:r>
+        <w:rPr>
+          <w:rStyle w:val="VerbatimChar"/>
+        </w:rPr>
         <w:t xml:space="preserve">lines = regexp(mdtext, '\r?\n', 'split');</w:t>
       </w:r>
       <w:r>
@@ -37910,6 +38344,96 @@
         <w:rPr>
           <w:rStyle w:val="VerbatimChar"/>
         </w:rPr>
+        <w:t xml:space="preserve">    % ---- image ------------------------------------------------------------</w:t>
+      </w:r>
+      <w:r>
+        <w:br/>
+      </w:r>
+      <w:r>
+        <w:rPr>
+          <w:rStyle w:val="VerbatimChar"/>
+        </w:rPr>
+        <w:t xml:space="preserve">    im = regexp(s, '^!\[([^\]]*)\]\(([^)]+)\)$', 'tokens', 'once');</w:t>
+      </w:r>
+      <w:r>
+        <w:br/>
+      </w:r>
+      <w:r>
+        <w:rPr>
+          <w:rStyle w:val="VerbatimChar"/>
+        </w:rPr>
+        <w:t xml:space="preserve">    if ~isempty(im)</w:t>
+      </w:r>
+      <w:r>
+        <w:br/>
+      </w:r>
+      <w:r>
+        <w:rPr>
+          <w:rStyle w:val="VerbatimChar"/>
+        </w:rPr>
+        <w:t xml:space="preserve">        [body{end+1}, images] = local_image(im{1}, im{2}, images, ...</w:t>
+      </w:r>
+      <w:r>
+        <w:br/>
+      </w:r>
+      <w:r>
+        <w:rPr>
+          <w:rStyle w:val="VerbatimChar"/>
+        </w:rPr>
+        <w:t xml:space="preserve">                                           emu_width, template); %#ok&lt;AGROW&gt;</w:t>
+      </w:r>
+      <w:r>
+        <w:br/>
+      </w:r>
+      <w:r>
+        <w:rPr>
+          <w:rStyle w:val="VerbatimChar"/>
+        </w:rPr>
+        <w:t xml:space="preserve">        i = i + 1;</w:t>
+      </w:r>
+      <w:r>
+        <w:br/>
+      </w:r>
+      <w:r>
+        <w:rPr>
+          <w:rStyle w:val="VerbatimChar"/>
+        </w:rPr>
+        <w:t xml:space="preserve">        after_heading = false;</w:t>
+      </w:r>
+      <w:r>
+        <w:br/>
+      </w:r>
+      <w:r>
+        <w:rPr>
+          <w:rStyle w:val="VerbatimChar"/>
+        </w:rPr>
+        <w:t xml:space="preserve">        continue</w:t>
+      </w:r>
+      <w:r>
+        <w:br/>
+      </w:r>
+      <w:r>
+        <w:rPr>
+          <w:rStyle w:val="VerbatimChar"/>
+        </w:rPr>
+        <w:t xml:space="preserve">    end</w:t>
+      </w:r>
+      <w:r>
+        <w:br/>
+      </w:r>
+      <w:r>
+        <w:rPr>
+          <w:rStyle w:val="VerbatimChar"/>
+        </w:rPr>
+        <w:t xml:space="preserve"/>
+      </w:r>
+      <w:r>
+        <w:br/>
+      </w:r>
+      <w:r>
+        <w:rPr>
+          <w:rStyle w:val="VerbatimChar"/>
+        </w:rPr>
         <w:t xml:space="preserve">    % ---- heading ----------------------------------------------------------</w:t>
       </w:r>
       <w:r>
@@ -38306,6 +38830,15 @@
         <w:rPr>
           <w:rStyle w:val="VerbatimChar"/>
         </w:rPr>
+        <w:t xml:space="preserve">           startsWith(s2, '![') || ...</w:t>
+      </w:r>
+      <w:r>
+        <w:br/>
+      </w:r>
+      <w:r>
+        <w:rPr>
+          <w:rStyle w:val="VerbatimChar"/>
+        </w:rPr>
         <w:t xml:space="preserve">           startsWith(s2, '$$') || ~isempty(regexp(s2, '^\d+\.\s', 'once'))</w:t>
       </w:r>
       <w:r>
@@ -38414,7 +38947,7 @@
         <w:rPr>
           <w:rStyle w:val="VerbatimChar"/>
         </w:rPr>
-        <w:t xml:space="preserve">% ---------------------------------------------------------- assemble part --</w:t>
+        <w:t xml:space="preserve">% --------------------------------------------------------- assemble parts --</w:t>
       </w:r>
       <w:r>
         <w:br/>
@@ -38441,7 +38974,7 @@
         <w:rPr>
           <w:rStyle w:val="VerbatimChar"/>
         </w:rPr>
-        <w:t xml:space="preserve">       '&lt;w:document ' W ' ' M ' ' R '&gt;&lt;w:body&gt;' ...</w:t>
+        <w:t xml:space="preserve">       '&lt;w:document ' W ' ' M ' ' R ' ' WP ' ' A ' ' PIC '&gt;&lt;w:body&gt;' ...</w:t>
       </w:r>
       <w:r>
         <w:br/>
@@ -38468,16 +39001,1078 @@
         <w:rPr>
           <w:rStyle w:val="VerbatimChar"/>
         </w:rPr>
-        <w:t xml:space="preserve">fk_zip_replace(template, outfile, 'word/document.xml', xml);</w:t>
-      </w:r>
-      <w:r>
-        <w:br/>
-      </w:r>
-      <w:r>
-        <w:rPr>
-          <w:rStyle w:val="VerbatimChar"/>
-        </w:rPr>
-        <w:t xml:space="preserve">fprintf('[docx] %s written, %d block elements\n', outfile, numel(body));</w:t>
+        <w:t xml:space="preserve">names = {'word/document.xml'};</w:t>
+      </w:r>
+      <w:r>
+        <w:br/>
+      </w:r>
+      <w:r>
+        <w:rPr>
+          <w:rStyle w:val="VerbatimChar"/>
+        </w:rPr>
+        <w:t xml:space="preserve">parts = {xml};</w:t>
+      </w:r>
+      <w:r>
+        <w:br/>
+      </w:r>
+      <w:r>
+        <w:rPr>
+          <w:rStyle w:val="VerbatimChar"/>
+        </w:rPr>
+        <w:t xml:space="preserve">if ~isempty(images)</w:t>
+      </w:r>
+      <w:r>
+        <w:br/>
+      </w:r>
+      <w:r>
+        <w:rPr>
+          <w:rStyle w:val="VerbatimChar"/>
+        </w:rPr>
+        <w:t xml:space="preserve">    names{end+1} = 'word/_rels/document.xml.rels';</w:t>
+      </w:r>
+      <w:r>
+        <w:br/>
+      </w:r>
+      <w:r>
+        <w:rPr>
+          <w:rStyle w:val="VerbatimChar"/>
+        </w:rPr>
+        <w:t xml:space="preserve">    parts{end+1} = local_rels(template, images);</w:t>
+      </w:r>
+      <w:r>
+        <w:br/>
+      </w:r>
+      <w:r>
+        <w:rPr>
+          <w:rStyle w:val="VerbatimChar"/>
+        </w:rPr>
+        <w:t xml:space="preserve">    names{end+1} = '[Content_Types].xml';</w:t>
+      </w:r>
+      <w:r>
+        <w:br/>
+      </w:r>
+      <w:r>
+        <w:rPr>
+          <w:rStyle w:val="VerbatimChar"/>
+        </w:rPr>
+        <w:t xml:space="preserve">    parts{end+1} = local_conttypes(template);</w:t>
+      </w:r>
+      <w:r>
+        <w:br/>
+      </w:r>
+      <w:r>
+        <w:rPr>
+          <w:rStyle w:val="VerbatimChar"/>
+        </w:rPr>
+        <w:t xml:space="preserve">    for k = 1:numel(images)</w:t>
+      </w:r>
+      <w:r>
+        <w:br/>
+      </w:r>
+      <w:r>
+        <w:rPr>
+          <w:rStyle w:val="VerbatimChar"/>
+        </w:rPr>
+        <w:t xml:space="preserve">        fid = fopen(images(k).path, 'r');</w:t>
+      </w:r>
+      <w:r>
+        <w:br/>
+      </w:r>
+      <w:r>
+        <w:rPr>
+          <w:rStyle w:val="VerbatimChar"/>
+        </w:rPr>
+        <w:t xml:space="preserve">        if fid &lt; 0</w:t>
+      </w:r>
+      <w:r>
+        <w:br/>
+      </w:r>
+      <w:r>
+        <w:rPr>
+          <w:rStyle w:val="VerbatimChar"/>
+        </w:rPr>
+        <w:t xml:space="preserve">            error('fk_md2docx:image', 'cannot read %s', images(k).path);</w:t>
+      </w:r>
+      <w:r>
+        <w:br/>
+      </w:r>
+      <w:r>
+        <w:rPr>
+          <w:rStyle w:val="VerbatimChar"/>
+        </w:rPr>
+        <w:t xml:space="preserve">        end</w:t>
+      </w:r>
+      <w:r>
+        <w:br/>
+      </w:r>
+      <w:r>
+        <w:rPr>
+          <w:rStyle w:val="VerbatimChar"/>
+        </w:rPr>
+        <w:t xml:space="preserve">        names{end+1} = images(k).part; %#ok&lt;AGROW&gt;</w:t>
+      </w:r>
+      <w:r>
+        <w:br/>
+      </w:r>
+      <w:r>
+        <w:rPr>
+          <w:rStyle w:val="VerbatimChar"/>
+        </w:rPr>
+        <w:t xml:space="preserve">        parts{end+1} = fread(fid, inf, '*uint8')'; %#ok&lt;AGROW&gt;</w:t>
+      </w:r>
+      <w:r>
+        <w:br/>
+      </w:r>
+      <w:r>
+        <w:rPr>
+          <w:rStyle w:val="VerbatimChar"/>
+        </w:rPr>
+        <w:t xml:space="preserve">        fclose(fid);</w:t>
+      </w:r>
+      <w:r>
+        <w:br/>
+      </w:r>
+      <w:r>
+        <w:rPr>
+          <w:rStyle w:val="VerbatimChar"/>
+        </w:rPr>
+        <w:t xml:space="preserve">    end</w:t>
+      </w:r>
+      <w:r>
+        <w:br/>
+      </w:r>
+      <w:r>
+        <w:rPr>
+          <w:rStyle w:val="VerbatimChar"/>
+        </w:rPr>
+        <w:t xml:space="preserve">end</w:t>
+      </w:r>
+      <w:r>
+        <w:br/>
+      </w:r>
+      <w:r>
+        <w:rPr>
+          <w:rStyle w:val="VerbatimChar"/>
+        </w:rPr>
+        <w:t xml:space="preserve"/>
+      </w:r>
+      <w:r>
+        <w:br/>
+      </w:r>
+      <w:r>
+        <w:rPr>
+          <w:rStyle w:val="VerbatimChar"/>
+        </w:rPr>
+        <w:t xml:space="preserve">fk_zip_write(template, outfile, names, parts);</w:t>
+      </w:r>
+      <w:r>
+        <w:br/>
+      </w:r>
+      <w:r>
+        <w:rPr>
+          <w:rStyle w:val="VerbatimChar"/>
+        </w:rPr>
+        <w:t xml:space="preserve">fprintf('[docx] %s written, %d block elements, %d figures embedded\n', ...</w:t>
+      </w:r>
+      <w:r>
+        <w:br/>
+      </w:r>
+      <w:r>
+        <w:rPr>
+          <w:rStyle w:val="VerbatimChar"/>
+        </w:rPr>
+        <w:t xml:space="preserve">        outfile, numel(body), numel(images));</w:t>
+      </w:r>
+      <w:r>
+        <w:br/>
+      </w:r>
+      <w:r>
+        <w:rPr>
+          <w:rStyle w:val="VerbatimChar"/>
+        </w:rPr>
+        <w:t xml:space="preserve">end</w:t>
+      </w:r>
+      <w:r>
+        <w:br/>
+      </w:r>
+      <w:r>
+        <w:rPr>
+          <w:rStyle w:val="VerbatimChar"/>
+        </w:rPr>
+        <w:t xml:space="preserve"/>
+      </w:r>
+      <w:r>
+        <w:br/>
+      </w:r>
+      <w:r>
+        <w:rPr>
+          <w:rStyle w:val="VerbatimChar"/>
+        </w:rPr>
+        <w:t xml:space="preserve">% =========================================================================</w:t>
+      </w:r>
+      <w:r>
+        <w:br/>
+      </w:r>
+      <w:r>
+        <w:rPr>
+          <w:rStyle w:val="VerbatimChar"/>
+        </w:rPr>
+        <w:t xml:space="preserve">function [p, images] = local_image(alt, relpath, images, emu_width, template)</w:t>
+      </w:r>
+      <w:r>
+        <w:br/>
+      </w:r>
+      <w:r>
+        <w:rPr>
+          <w:rStyle w:val="VerbatimChar"/>
+        </w:rPr>
+        <w:t xml:space="preserve">%LOCAL_IMAGE  An inline picture, sized to the text measure, aspect preserved.</w:t>
+      </w:r>
+      <w:r>
+        <w:br/>
+      </w:r>
+      <w:r>
+        <w:rPr>
+          <w:rStyle w:val="VerbatimChar"/>
+        </w:rPr>
+        <w:t xml:space="preserve">here = fileparts(mfilename('fullpath'));</w:t>
+      </w:r>
+      <w:r>
+        <w:br/>
+      </w:r>
+      <w:r>
+        <w:rPr>
+          <w:rStyle w:val="VerbatimChar"/>
+        </w:rPr>
+        <w:t xml:space="preserve">path = relpath;</w:t>
+      </w:r>
+      <w:r>
+        <w:br/>
+      </w:r>
+      <w:r>
+        <w:rPr>
+          <w:rStyle w:val="VerbatimChar"/>
+        </w:rPr>
+        <w:t xml:space="preserve">if ~exist(path, 'file')</w:t>
+      </w:r>
+      <w:r>
+        <w:br/>
+      </w:r>
+      <w:r>
+        <w:rPr>
+          <w:rStyle w:val="VerbatimChar"/>
+        </w:rPr>
+        <w:t xml:space="preserve">    path = fullfile(here, relpath);</w:t>
+      </w:r>
+      <w:r>
+        <w:br/>
+      </w:r>
+      <w:r>
+        <w:rPr>
+          <w:rStyle w:val="VerbatimChar"/>
+        </w:rPr>
+        <w:t xml:space="preserve">end</w:t>
+      </w:r>
+      <w:r>
+        <w:br/>
+      </w:r>
+      <w:r>
+        <w:rPr>
+          <w:rStyle w:val="VerbatimChar"/>
+        </w:rPr>
+        <w:t xml:space="preserve">if ~exist(path, 'file')</w:t>
+      </w:r>
+      <w:r>
+        <w:br/>
+      </w:r>
+      <w:r>
+        <w:rPr>
+          <w:rStyle w:val="VerbatimChar"/>
+        </w:rPr>
+        <w:t xml:space="preserve">    path = fullfile(fileparts(template), relpath);</w:t>
+      </w:r>
+      <w:r>
+        <w:br/>
+      </w:r>
+      <w:r>
+        <w:rPr>
+          <w:rStyle w:val="VerbatimChar"/>
+        </w:rPr>
+        <w:t xml:space="preserve">end</w:t>
+      </w:r>
+      <w:r>
+        <w:br/>
+      </w:r>
+      <w:r>
+        <w:rPr>
+          <w:rStyle w:val="VerbatimChar"/>
+        </w:rPr>
+        <w:t xml:space="preserve">if ~exist(path, 'file')</w:t>
+      </w:r>
+      <w:r>
+        <w:br/>
+      </w:r>
+      <w:r>
+        <w:rPr>
+          <w:rStyle w:val="VerbatimChar"/>
+        </w:rPr>
+        <w:t xml:space="preserve">    error('fk_md2docx:missingimage', 'image not found: %s', relpath);</w:t>
+      </w:r>
+      <w:r>
+        <w:br/>
+      </w:r>
+      <w:r>
+        <w:rPr>
+          <w:rStyle w:val="VerbatimChar"/>
+        </w:rPr>
+        <w:t xml:space="preserve">end</w:t>
+      </w:r>
+      <w:r>
+        <w:br/>
+      </w:r>
+      <w:r>
+        <w:rPr>
+          <w:rStyle w:val="VerbatimChar"/>
+        </w:rPr>
+        <w:t xml:space="preserve"/>
+      </w:r>
+      <w:r>
+        <w:br/>
+      </w:r>
+      <w:r>
+        <w:rPr>
+          <w:rStyle w:val="VerbatimChar"/>
+        </w:rPr>
+        <w:t xml:space="preserve">[pw, ph] = fk_png_size(path);</w:t>
+      </w:r>
+      <w:r>
+        <w:br/>
+      </w:r>
+      <w:r>
+        <w:rPr>
+          <w:rStyle w:val="VerbatimChar"/>
+        </w:rPr>
+        <w:t xml:space="preserve">cx = round(emu_width);</w:t>
+      </w:r>
+      <w:r>
+        <w:br/>
+      </w:r>
+      <w:r>
+        <w:rPr>
+          <w:rStyle w:val="VerbatimChar"/>
+        </w:rPr>
+        <w:t xml:space="preserve">cy = round(cx * ph / pw);</w:t>
+      </w:r>
+      <w:r>
+        <w:br/>
+      </w:r>
+      <w:r>
+        <w:rPr>
+          <w:rStyle w:val="VerbatimChar"/>
+        </w:rPr>
+        <w:t xml:space="preserve"/>
+      </w:r>
+      <w:r>
+        <w:br/>
+      </w:r>
+      <w:r>
+        <w:rPr>
+          <w:rStyle w:val="VerbatimChar"/>
+        </w:rPr>
+        <w:t xml:space="preserve">k = numel(images) + 1;</w:t>
+      </w:r>
+      <w:r>
+        <w:br/>
+      </w:r>
+      <w:r>
+        <w:rPr>
+          <w:rStyle w:val="VerbatimChar"/>
+        </w:rPr>
+        <w:t xml:space="preserve">images(k).path = path;</w:t>
+      </w:r>
+      <w:r>
+        <w:br/>
+      </w:r>
+      <w:r>
+        <w:rPr>
+          <w:rStyle w:val="VerbatimChar"/>
+        </w:rPr>
+        <w:t xml:space="preserve">images(k).part = sprintf('word/media/image%d.png', k);</w:t>
+      </w:r>
+      <w:r>
+        <w:br/>
+      </w:r>
+      <w:r>
+        <w:rPr>
+          <w:rStyle w:val="VerbatimChar"/>
+        </w:rPr>
+        <w:t xml:space="preserve">images(k).rid  = sprintf('rIdFig%d', k);</w:t>
+      </w:r>
+      <w:r>
+        <w:br/>
+      </w:r>
+      <w:r>
+        <w:rPr>
+          <w:rStyle w:val="VerbatimChar"/>
+        </w:rPr>
+        <w:t xml:space="preserve">images(k).cx = cx;</w:t>
+      </w:r>
+      <w:r>
+        <w:br/>
+      </w:r>
+      <w:r>
+        <w:rPr>
+          <w:rStyle w:val="VerbatimChar"/>
+        </w:rPr>
+        <w:t xml:space="preserve">images(k).cy = cy;</w:t>
+      </w:r>
+      <w:r>
+        <w:br/>
+      </w:r>
+      <w:r>
+        <w:rPr>
+          <w:rStyle w:val="VerbatimChar"/>
+        </w:rPr>
+        <w:t xml:space="preserve">images(k).alt = alt;</w:t>
+      </w:r>
+      <w:r>
+        <w:br/>
+      </w:r>
+      <w:r>
+        <w:rPr>
+          <w:rStyle w:val="VerbatimChar"/>
+        </w:rPr>
+        <w:t xml:space="preserve"/>
+      </w:r>
+      <w:r>
+        <w:br/>
+      </w:r>
+      <w:r>
+        <w:rPr>
+          <w:rStyle w:val="VerbatimChar"/>
+        </w:rPr>
+        <w:t xml:space="preserve">id = num2str(1000 + k);</w:t>
+      </w:r>
+      <w:r>
+        <w:br/>
+      </w:r>
+      <w:r>
+        <w:rPr>
+          <w:rStyle w:val="VerbatimChar"/>
+        </w:rPr>
+        <w:t xml:space="preserve">p = ['&lt;w:p&gt;&lt;w:pPr&gt;&lt;w:pStyle w:val="Compact"/&gt;' ...</w:t>
+      </w:r>
+      <w:r>
+        <w:br/>
+      </w:r>
+      <w:r>
+        <w:rPr>
+          <w:rStyle w:val="VerbatimChar"/>
+        </w:rPr>
+        <w:t xml:space="preserve">     '&lt;w:jc w:val="center"/&gt;&lt;/w:pPr&gt;&lt;w:r&gt;&lt;w:drawing&gt;' ...</w:t>
+      </w:r>
+      <w:r>
+        <w:br/>
+      </w:r>
+      <w:r>
+        <w:rPr>
+          <w:rStyle w:val="VerbatimChar"/>
+        </w:rPr>
+        <w:t xml:space="preserve">     '&lt;wp:inline distT="0" distB="0" distL="0" distR="0"&gt;' ...</w:t>
+      </w:r>
+      <w:r>
+        <w:br/>
+      </w:r>
+      <w:r>
+        <w:rPr>
+          <w:rStyle w:val="VerbatimChar"/>
+        </w:rPr>
+        <w:t xml:space="preserve">     '&lt;wp:extent cx="' num2str(cx) '" cy="' num2str(cy) '"/&gt;' ...</w:t>
+      </w:r>
+      <w:r>
+        <w:br/>
+      </w:r>
+      <w:r>
+        <w:rPr>
+          <w:rStyle w:val="VerbatimChar"/>
+        </w:rPr>
+        <w:t xml:space="preserve">     '&lt;wp:effectExtent l="0" t="0" r="0" b="0"/&gt;' ...</w:t>
+      </w:r>
+      <w:r>
+        <w:br/>
+      </w:r>
+      <w:r>
+        <w:rPr>
+          <w:rStyle w:val="VerbatimChar"/>
+        </w:rPr>
+        <w:t xml:space="preserve">     '&lt;wp:docPr id="' id '" name="Picture ' id '" descr="' ...</w:t>
+      </w:r>
+      <w:r>
+        <w:br/>
+      </w:r>
+      <w:r>
+        <w:rPr>
+          <w:rStyle w:val="VerbatimChar"/>
+        </w:rPr>
+        <w:t xml:space="preserve">     fk_xmlesc(alt) '"/&gt;' ...</w:t>
+      </w:r>
+      <w:r>
+        <w:br/>
+      </w:r>
+      <w:r>
+        <w:rPr>
+          <w:rStyle w:val="VerbatimChar"/>
+        </w:rPr>
+        <w:t xml:space="preserve">     '&lt;wp:cNvGraphicFramePr&gt;&lt;a:graphicFrameLocks noChangeAspect="1"/&gt;' ...</w:t>
+      </w:r>
+      <w:r>
+        <w:br/>
+      </w:r>
+      <w:r>
+        <w:rPr>
+          <w:rStyle w:val="VerbatimChar"/>
+        </w:rPr>
+        <w:t xml:space="preserve">     '&lt;/wp:cNvGraphicFramePr&gt;' ...</w:t>
+      </w:r>
+      <w:r>
+        <w:br/>
+      </w:r>
+      <w:r>
+        <w:rPr>
+          <w:rStyle w:val="VerbatimChar"/>
+        </w:rPr>
+        <w:t xml:space="preserve">     '&lt;a:graphic&gt;&lt;a:graphicData uri="http://schemas.openxmlformats.org/' ...</w:t>
+      </w:r>
+      <w:r>
+        <w:br/>
+      </w:r>
+      <w:r>
+        <w:rPr>
+          <w:rStyle w:val="VerbatimChar"/>
+        </w:rPr>
+        <w:t xml:space="preserve">     'drawingml/2006/picture"&gt;&lt;pic:pic&gt;&lt;pic:nvPicPr&gt;' ...</w:t>
+      </w:r>
+      <w:r>
+        <w:br/>
+      </w:r>
+      <w:r>
+        <w:rPr>
+          <w:rStyle w:val="VerbatimChar"/>
+        </w:rPr>
+        <w:t xml:space="preserve">     '&lt;pic:cNvPr id="' id '" name="Picture ' id '"/&gt;&lt;pic:cNvPicPr/&gt;' ...</w:t>
+      </w:r>
+      <w:r>
+        <w:br/>
+      </w:r>
+      <w:r>
+        <w:rPr>
+          <w:rStyle w:val="VerbatimChar"/>
+        </w:rPr>
+        <w:t xml:space="preserve">     '&lt;/pic:nvPicPr&gt;&lt;pic:blipFill&gt;&lt;a:blip r:embed="' images(k).rid '"/&gt;' ...</w:t>
+      </w:r>
+      <w:r>
+        <w:br/>
+      </w:r>
+      <w:r>
+        <w:rPr>
+          <w:rStyle w:val="VerbatimChar"/>
+        </w:rPr>
+        <w:t xml:space="preserve">     '&lt;a:stretch&gt;&lt;a:fillRect/&gt;&lt;/a:stretch&gt;&lt;/pic:blipFill&gt;' ...</w:t>
+      </w:r>
+      <w:r>
+        <w:br/>
+      </w:r>
+      <w:r>
+        <w:rPr>
+          <w:rStyle w:val="VerbatimChar"/>
+        </w:rPr>
+        <w:t xml:space="preserve">     '&lt;pic:spPr&gt;&lt;a:xfrm&gt;&lt;a:off x="0" y="0"/&gt;&lt;a:ext cx="' num2str(cx) ...</w:t>
+      </w:r>
+      <w:r>
+        <w:br/>
+      </w:r>
+      <w:r>
+        <w:rPr>
+          <w:rStyle w:val="VerbatimChar"/>
+        </w:rPr>
+        <w:t xml:space="preserve">     '" cy="' num2str(cy) '"/&gt;&lt;/a:xfrm&gt;' ...</w:t>
+      </w:r>
+      <w:r>
+        <w:br/>
+      </w:r>
+      <w:r>
+        <w:rPr>
+          <w:rStyle w:val="VerbatimChar"/>
+        </w:rPr>
+        <w:t xml:space="preserve">     '&lt;a:prstGeom prst="rect"&gt;&lt;a:avLst/&gt;&lt;/a:prstGeom&gt;&lt;/pic:spPr&gt;' ...</w:t>
+      </w:r>
+      <w:r>
+        <w:br/>
+      </w:r>
+      <w:r>
+        <w:rPr>
+          <w:rStyle w:val="VerbatimChar"/>
+        </w:rPr>
+        <w:t xml:space="preserve">     '&lt;/pic:pic&gt;&lt;/a:graphicData&gt;&lt;/a:graphic&gt;&lt;/wp:inline&gt;' ...</w:t>
+      </w:r>
+      <w:r>
+        <w:br/>
+      </w:r>
+      <w:r>
+        <w:rPr>
+          <w:rStyle w:val="VerbatimChar"/>
+        </w:rPr>
+        <w:t xml:space="preserve">     '&lt;/w:drawing&gt;&lt;/w:r&gt;&lt;/w:p&gt;'];</w:t>
+      </w:r>
+      <w:r>
+        <w:br/>
+      </w:r>
+      <w:r>
+        <w:rPr>
+          <w:rStyle w:val="VerbatimChar"/>
+        </w:rPr>
+        <w:t xml:space="preserve">end</w:t>
+      </w:r>
+      <w:r>
+        <w:br/>
+      </w:r>
+      <w:r>
+        <w:rPr>
+          <w:rStyle w:val="VerbatimChar"/>
+        </w:rPr>
+        <w:t xml:space="preserve"/>
+      </w:r>
+      <w:r>
+        <w:br/>
+      </w:r>
+      <w:r>
+        <w:rPr>
+          <w:rStyle w:val="VerbatimChar"/>
+        </w:rPr>
+        <w:t xml:space="preserve">% =========================================================================</w:t>
+      </w:r>
+      <w:r>
+        <w:br/>
+      </w:r>
+      <w:r>
+        <w:rPr>
+          <w:rStyle w:val="VerbatimChar"/>
+        </w:rPr>
+        <w:t xml:space="preserve">function w = local_textwidth(template)</w:t>
+      </w:r>
+      <w:r>
+        <w:br/>
+      </w:r>
+      <w:r>
+        <w:rPr>
+          <w:rStyle w:val="VerbatimChar"/>
+        </w:rPr>
+        <w:t xml:space="preserve">%LOCAL_TEXTWIDTH  Page width less the margins, in EMU.  One twip is 635 EMU.</w:t>
+      </w:r>
+      <w:r>
+        <w:br/>
+      </w:r>
+      <w:r>
+        <w:rPr>
+          <w:rStyle w:val="VerbatimChar"/>
+        </w:rPr>
+        <w:t xml:space="preserve">d = local_readpart(template, 'word/document.xml');</w:t>
+      </w:r>
+      <w:r>
+        <w:br/>
+      </w:r>
+      <w:r>
+        <w:rPr>
+          <w:rStyle w:val="VerbatimChar"/>
+        </w:rPr>
+        <w:t xml:space="preserve">pg = regexp(d, '&lt;w:pgSz[^&gt;]*w:w="(\d+)"', 'tokens', 'once');</w:t>
+      </w:r>
+      <w:r>
+        <w:br/>
+      </w:r>
+      <w:r>
+        <w:rPr>
+          <w:rStyle w:val="VerbatimChar"/>
+        </w:rPr>
+        <w:t xml:space="preserve">mg = regexp(d, '&lt;w:pgMar[^&gt;]*/&gt;', 'match', 'once');</w:t>
+      </w:r>
+      <w:r>
+        <w:br/>
+      </w:r>
+      <w:r>
+        <w:rPr>
+          <w:rStyle w:val="VerbatimChar"/>
+        </w:rPr>
+        <w:t xml:space="preserve">l = regexp(mg, 'w:left="(\d+)"', 'tokens', 'once');</w:t>
+      </w:r>
+      <w:r>
+        <w:br/>
+      </w:r>
+      <w:r>
+        <w:rPr>
+          <w:rStyle w:val="VerbatimChar"/>
+        </w:rPr>
+        <w:t xml:space="preserve">r = regexp(mg, 'w:right="(\d+)"', 'tokens', 'once');</w:t>
+      </w:r>
+      <w:r>
+        <w:br/>
+      </w:r>
+      <w:r>
+        <w:rPr>
+          <w:rStyle w:val="VerbatimChar"/>
+        </w:rPr>
+        <w:t xml:space="preserve">if isempty(pg) || isempty(l) || isempty(r)</w:t>
+      </w:r>
+      <w:r>
+        <w:br/>
+      </w:r>
+      <w:r>
+        <w:rPr>
+          <w:rStyle w:val="VerbatimChar"/>
+        </w:rPr>
+        <w:t xml:space="preserve">    error('fk_md2docx:pagesize', 'cannot read the page setup');</w:t>
+      </w:r>
+      <w:r>
+        <w:br/>
+      </w:r>
+      <w:r>
+        <w:rPr>
+          <w:rStyle w:val="VerbatimChar"/>
+        </w:rPr>
+        <w:t xml:space="preserve">end</w:t>
+      </w:r>
+      <w:r>
+        <w:br/>
+      </w:r>
+      <w:r>
+        <w:rPr>
+          <w:rStyle w:val="VerbatimChar"/>
+        </w:rPr>
+        <w:t xml:space="preserve">twips = str2double(pg{1}) - str2double(l{1}) - str2double(r{1});</w:t>
+      </w:r>
+      <w:r>
+        <w:br/>
+      </w:r>
+      <w:r>
+        <w:rPr>
+          <w:rStyle w:val="VerbatimChar"/>
+        </w:rPr>
+        <w:t xml:space="preserve">w = twips * 635 * 0.98;              % a shade under the measure</w:t>
+      </w:r>
+      <w:r>
+        <w:br/>
+      </w:r>
+      <w:r>
+        <w:rPr>
+          <w:rStyle w:val="VerbatimChar"/>
+        </w:rPr>
+        <w:t xml:space="preserve">end</w:t>
+      </w:r>
+      <w:r>
+        <w:br/>
+      </w:r>
+      <w:r>
+        <w:rPr>
+          <w:rStyle w:val="VerbatimChar"/>
+        </w:rPr>
+        <w:t xml:space="preserve"/>
+      </w:r>
+      <w:r>
+        <w:br/>
+      </w:r>
+      <w:r>
+        <w:rPr>
+          <w:rStyle w:val="VerbatimChar"/>
+        </w:rPr>
+        <w:t xml:space="preserve">% =========================================================================</w:t>
+      </w:r>
+      <w:r>
+        <w:br/>
+      </w:r>
+      <w:r>
+        <w:rPr>
+          <w:rStyle w:val="VerbatimChar"/>
+        </w:rPr>
+        <w:t xml:space="preserve">function x = local_rels(template, images)</w:t>
+      </w:r>
+      <w:r>
+        <w:br/>
+      </w:r>
+      <w:r>
+        <w:rPr>
+          <w:rStyle w:val="VerbatimChar"/>
+        </w:rPr>
+        <w:t xml:space="preserve">x = local_readpart(template, 'word/_rels/document.xml.rels');</w:t>
+      </w:r>
+      <w:r>
+        <w:br/>
+      </w:r>
+      <w:r>
+        <w:rPr>
+          <w:rStyle w:val="VerbatimChar"/>
+        </w:rPr>
+        <w:t xml:space="preserve">add = '';</w:t>
+      </w:r>
+      <w:r>
+        <w:br/>
+      </w:r>
+      <w:r>
+        <w:rPr>
+          <w:rStyle w:val="VerbatimChar"/>
+        </w:rPr>
+        <w:t xml:space="preserve">for k = 1:numel(images)</w:t>
+      </w:r>
+      <w:r>
+        <w:br/>
+      </w:r>
+      <w:r>
+        <w:rPr>
+          <w:rStyle w:val="VerbatimChar"/>
+        </w:rPr>
+        <w:t xml:space="preserve">    add = [add '&lt;Relationship Id="' images(k).rid '" Type="http://' ...</w:t>
+      </w:r>
+      <w:r>
+        <w:br/>
+      </w:r>
+      <w:r>
+        <w:rPr>
+          <w:rStyle w:val="VerbatimChar"/>
+        </w:rPr>
+        <w:t xml:space="preserve">           'schemas.openxmlformats.org/officeDocument/2006/relationships/' ...</w:t>
+      </w:r>
+      <w:r>
+        <w:br/>
+      </w:r>
+      <w:r>
+        <w:rPr>
+          <w:rStyle w:val="VerbatimChar"/>
+        </w:rPr>
+        <w:t xml:space="preserve">           'image" Target="media/image' num2str(k) '.png"/&gt;']; %#ok&lt;AGROW&gt;</w:t>
+      </w:r>
+      <w:r>
+        <w:br/>
+      </w:r>
+      <w:r>
+        <w:rPr>
+          <w:rStyle w:val="VerbatimChar"/>
+        </w:rPr>
+        <w:t xml:space="preserve">end</w:t>
+      </w:r>
+      <w:r>
+        <w:br/>
+      </w:r>
+      <w:r>
+        <w:rPr>
+          <w:rStyle w:val="VerbatimChar"/>
+        </w:rPr>
+        <w:t xml:space="preserve">x = strrep(x, '&lt;/Relationships&gt;', [add '&lt;/Relationships&gt;']);</w:t>
+      </w:r>
+      <w:r>
+        <w:br/>
+      </w:r>
+      <w:r>
+        <w:rPr>
+          <w:rStyle w:val="VerbatimChar"/>
+        </w:rPr>
+        <w:t xml:space="preserve">end</w:t>
+      </w:r>
+      <w:r>
+        <w:br/>
+      </w:r>
+      <w:r>
+        <w:rPr>
+          <w:rStyle w:val="VerbatimChar"/>
+        </w:rPr>
+        <w:t xml:space="preserve"/>
+      </w:r>
+      <w:r>
+        <w:br/>
+      </w:r>
+      <w:r>
+        <w:rPr>
+          <w:rStyle w:val="VerbatimChar"/>
+        </w:rPr>
+        <w:t xml:space="preserve">% =========================================================================</w:t>
+      </w:r>
+      <w:r>
+        <w:br/>
+      </w:r>
+      <w:r>
+        <w:rPr>
+          <w:rStyle w:val="VerbatimChar"/>
+        </w:rPr>
+        <w:t xml:space="preserve">function x = local_conttypes(template)</w:t>
+      </w:r>
+      <w:r>
+        <w:br/>
+      </w:r>
+      <w:r>
+        <w:rPr>
+          <w:rStyle w:val="VerbatimChar"/>
+        </w:rPr>
+        <w:t xml:space="preserve">x = local_readpart(template, '[Content_Types].xml');</w:t>
+      </w:r>
+      <w:r>
+        <w:br/>
+      </w:r>
+      <w:r>
+        <w:rPr>
+          <w:rStyle w:val="VerbatimChar"/>
+        </w:rPr>
+        <w:t xml:space="preserve">if ~contains(x, 'Extension="png"')</w:t>
+      </w:r>
+      <w:r>
+        <w:br/>
+      </w:r>
+      <w:r>
+        <w:rPr>
+          <w:rStyle w:val="VerbatimChar"/>
+        </w:rPr>
+        <w:t xml:space="preserve">    % strrep would replace every occurrence, so insert once at the first</w:t>
+      </w:r>
+      <w:r>
+        <w:br/>
+      </w:r>
+      <w:r>
+        <w:rPr>
+          <w:rStyle w:val="VerbatimChar"/>
+        </w:rPr>
+        <w:t xml:space="preserve">    % Default element.</w:t>
+      </w:r>
+      <w:r>
+        <w:br/>
+      </w:r>
+      <w:r>
+        <w:rPr>
+          <w:rStyle w:val="VerbatimChar"/>
+        </w:rPr>
+        <w:t xml:space="preserve">    j = strfind(x, '&lt;Default');</w:t>
+      </w:r>
+      <w:r>
+        <w:br/>
+      </w:r>
+      <w:r>
+        <w:rPr>
+          <w:rStyle w:val="VerbatimChar"/>
+        </w:rPr>
+        <w:t xml:space="preserve">    assert(~isempty(j), 'no Default element in [Content_Types].xml');</w:t>
+      </w:r>
+      <w:r>
+        <w:br/>
+      </w:r>
+      <w:r>
+        <w:rPr>
+          <w:rStyle w:val="VerbatimChar"/>
+        </w:rPr>
+        <w:t xml:space="preserve">    x = [x(1:j(1)-1) ...</w:t>
+      </w:r>
+      <w:r>
+        <w:br/>
+      </w:r>
+      <w:r>
+        <w:rPr>
+          <w:rStyle w:val="VerbatimChar"/>
+        </w:rPr>
+        <w:t xml:space="preserve">         '&lt;Default Extension="png" ContentType="image/png"/&gt;' ...</w:t>
+      </w:r>
+      <w:r>
+        <w:br/>
+      </w:r>
+      <w:r>
+        <w:rPr>
+          <w:rStyle w:val="VerbatimChar"/>
+        </w:rPr>
+        <w:t xml:space="preserve">         x(j(1):end)];</w:t>
+      </w:r>
+      <w:r>
+        <w:br/>
+      </w:r>
+      <w:r>
+        <w:rPr>
+          <w:rStyle w:val="VerbatimChar"/>
+        </w:rPr>
+        <w:t xml:space="preserve">end</w:t>
+      </w:r>
+      <w:r>
+        <w:br/>
+      </w:r>
+      <w:r>
+        <w:rPr>
+          <w:rStyle w:val="VerbatimChar"/>
+        </w:rPr>
+        <w:t xml:space="preserve">end</w:t>
+      </w:r>
+      <w:r>
+        <w:br/>
+      </w:r>
+      <w:r>
+        <w:rPr>
+          <w:rStyle w:val="VerbatimChar"/>
+        </w:rPr>
+        <w:t xml:space="preserve"/>
+      </w:r>
+      <w:r>
+        <w:br/>
+      </w:r>
+      <w:r>
+        <w:rPr>
+          <w:rStyle w:val="VerbatimChar"/>
+        </w:rPr>
+        <w:t xml:space="preserve">% =========================================================================</w:t>
+      </w:r>
+      <w:r>
+        <w:br/>
+      </w:r>
+      <w:r>
+        <w:rPr>
+          <w:rStyle w:val="VerbatimChar"/>
+        </w:rPr>
+        <w:t xml:space="preserve">function t = local_readpart(zipfile, partname)</w:t>
+      </w:r>
+      <w:r>
+        <w:br/>
+      </w:r>
+      <w:r>
+        <w:rPr>
+          <w:rStyle w:val="VerbatimChar"/>
+        </w:rPr>
+        <w:t xml:space="preserve">tmp = tempname;</w:t>
+      </w:r>
+      <w:r>
+        <w:br/>
+      </w:r>
+      <w:r>
+        <w:rPr>
+          <w:rStyle w:val="VerbatimChar"/>
+        </w:rPr>
+        <w:t xml:space="preserve">mkdir(tmp);</w:t>
+      </w:r>
+      <w:r>
+        <w:br/>
+      </w:r>
+      <w:r>
+        <w:rPr>
+          <w:rStyle w:val="VerbatimChar"/>
+        </w:rPr>
+        <w:t xml:space="preserve">c = onCleanup(@() rmdir(tmp, 's')); %#ok&lt;NASGU&gt;</w:t>
+      </w:r>
+      <w:r>
+        <w:br/>
+      </w:r>
+      <w:r>
+        <w:rPr>
+          <w:rStyle w:val="VerbatimChar"/>
+        </w:rPr>
+        <w:t xml:space="preserve">unzip(zipfile, tmp);</w:t>
+      </w:r>
+      <w:r>
+        <w:br/>
+      </w:r>
+      <w:r>
+        <w:rPr>
+          <w:rStyle w:val="VerbatimChar"/>
+        </w:rPr>
+        <w:t xml:space="preserve">t = fileread(fullfile(tmp, strrep(partname, '/', filesep)));</w:t>
       </w:r>
       <w:r>
         <w:br/>
@@ -42132,6 +43727,33 @@
         <w:rPr>
           <w:rStyle w:val="VerbatimChar"/>
         </w:rPr>
+        <w:t xml:space="preserve">%    7. Every figure caption has a picture above it.  This check exists</w:t>
+      </w:r>
+      <w:r>
+        <w:br/>
+      </w:r>
+      <w:r>
+        <w:rPr>
+          <w:rStyle w:val="VerbatimChar"/>
+        </w:rPr>
+        <w:t xml:space="preserve">%       because the first builds carried the captions and none of the</w:t>
+      </w:r>
+      <w:r>
+        <w:br/>
+      </w:r>
+      <w:r>
+        <w:rPr>
+          <w:rStyle w:val="VerbatimChar"/>
+        </w:rPr>
+        <w:t xml:space="preserve">%       figures, and nothing in the document said so.</w:t>
+      </w:r>
+      <w:r>
+        <w:br/>
+      </w:r>
+      <w:r>
+        <w:rPr>
+          <w:rStyle w:val="VerbatimChar"/>
+        </w:rPr>
         <w:t xml:space="preserve"/>
       </w:r>
       <w:r>
@@ -42942,6 +44564,123 @@
         <w:rPr>
           <w:rStyle w:val="VerbatimChar"/>
         </w:rPr>
+        <w:t xml:space="preserve">% ---- 7. figures present ---------------------------------------------------</w:t>
+      </w:r>
+      <w:r>
+        <w:br/>
+      </w:r>
+      <w:r>
+        <w:rPr>
+          <w:rStyle w:val="VerbatimChar"/>
+        </w:rPr>
+        <w:t xml:space="preserve">raw = local_rawxml(docx);</w:t>
+      </w:r>
+      <w:r>
+        <w:br/>
+      </w:r>
+      <w:r>
+        <w:rPr>
+          <w:rStyle w:val="VerbatimChar"/>
+        </w:rPr>
+        <w:t xml:space="preserve">nimg = numel(strfind(raw, '&lt;w:drawing&gt;'));</w:t>
+      </w:r>
+      <w:r>
+        <w:br/>
+      </w:r>
+      <w:r>
+        <w:rPr>
+          <w:rStyle w:val="VerbatimChar"/>
+        </w:rPr>
+        <w:t xml:space="preserve">ncap = sum(cellfun(@(t) ~isempty(regexp(strtrim(t), ...</w:t>
+      </w:r>
+      <w:r>
+        <w:br/>
+      </w:r>
+      <w:r>
+        <w:rPr>
+          <w:rStyle w:val="VerbatimChar"/>
+        </w:rPr>
+        <w:t xml:space="preserve">           '^(Figure \d+\.|Graphical abstract\.)', 'once')), paras));</w:t>
+      </w:r>
+      <w:r>
+        <w:br/>
+      </w:r>
+      <w:r>
+        <w:rPr>
+          <w:rStyle w:val="VerbatimChar"/>
+        </w:rPr>
+        <w:t xml:space="preserve">fprintf('[verify] %d figures embedded, %d captions\n', nimg, ncap);</w:t>
+      </w:r>
+      <w:r>
+        <w:br/>
+      </w:r>
+      <w:r>
+        <w:rPr>
+          <w:rStyle w:val="VerbatimChar"/>
+        </w:rPr>
+        <w:t xml:space="preserve">if ncap == 0</w:t>
+      </w:r>
+      <w:r>
+        <w:br/>
+      </w:r>
+      <w:r>
+        <w:rPr>
+          <w:rStyle w:val="VerbatimChar"/>
+        </w:rPr>
+        <w:t xml:space="preserve">    fails{end+1} = 'no figure captions found';</w:t>
+      </w:r>
+      <w:r>
+        <w:br/>
+      </w:r>
+      <w:r>
+        <w:rPr>
+          <w:rStyle w:val="VerbatimChar"/>
+        </w:rPr>
+        <w:t xml:space="preserve">elseif nimg &lt; ncap</w:t>
+      </w:r>
+      <w:r>
+        <w:br/>
+      </w:r>
+      <w:r>
+        <w:rPr>
+          <w:rStyle w:val="VerbatimChar"/>
+        </w:rPr>
+        <w:t xml:space="preserve">    fails{end+1} = sprintf('%d captions but only %d figures embedded', ...</w:t>
+      </w:r>
+      <w:r>
+        <w:br/>
+      </w:r>
+      <w:r>
+        <w:rPr>
+          <w:rStyle w:val="VerbatimChar"/>
+        </w:rPr>
+        <w:t xml:space="preserve">                           ncap, nimg);</w:t>
+      </w:r>
+      <w:r>
+        <w:br/>
+      </w:r>
+      <w:r>
+        <w:rPr>
+          <w:rStyle w:val="VerbatimChar"/>
+        </w:rPr>
+        <w:t xml:space="preserve">end</w:t>
+      </w:r>
+      <w:r>
+        <w:br/>
+      </w:r>
+      <w:r>
+        <w:rPr>
+          <w:rStyle w:val="VerbatimChar"/>
+        </w:rPr>
+        <w:t xml:space="preserve"/>
+      </w:r>
+      <w:r>
+        <w:br/>
+      </w:r>
+      <w:r>
+        <w:rPr>
+          <w:rStyle w:val="VerbatimChar"/>
+        </w:rPr>
         <w:t xml:space="preserve">% ---- report ---------------------------------------------------------------</w:t>
       </w:r>
       <w:r>
@@ -43240,6 +44979,78 @@
           <w:rStyle w:val="VerbatimChar"/>
         </w:rPr>
         <w:t xml:space="preserve">text = strjoin(paras, newline);</w:t>
+      </w:r>
+      <w:r>
+        <w:br/>
+      </w:r>
+      <w:r>
+        <w:rPr>
+          <w:rStyle w:val="VerbatimChar"/>
+        </w:rPr>
+        <w:t xml:space="preserve">end</w:t>
+      </w:r>
+      <w:r>
+        <w:br/>
+      </w:r>
+      <w:r>
+        <w:rPr>
+          <w:rStyle w:val="VerbatimChar"/>
+        </w:rPr>
+        <w:t xml:space="preserve"/>
+      </w:r>
+      <w:r>
+        <w:br/>
+      </w:r>
+      <w:r>
+        <w:rPr>
+          <w:rStyle w:val="VerbatimChar"/>
+        </w:rPr>
+        <w:t xml:space="preserve">function x = local_rawxml(docx)</w:t>
+      </w:r>
+      <w:r>
+        <w:br/>
+      </w:r>
+      <w:r>
+        <w:rPr>
+          <w:rStyle w:val="VerbatimChar"/>
+        </w:rPr>
+        <w:t xml:space="preserve">tmp = tempname;</w:t>
+      </w:r>
+      <w:r>
+        <w:br/>
+      </w:r>
+      <w:r>
+        <w:rPr>
+          <w:rStyle w:val="VerbatimChar"/>
+        </w:rPr>
+        <w:t xml:space="preserve">mkdir(tmp);</w:t>
+      </w:r>
+      <w:r>
+        <w:br/>
+      </w:r>
+      <w:r>
+        <w:rPr>
+          <w:rStyle w:val="VerbatimChar"/>
+        </w:rPr>
+        <w:t xml:space="preserve">c = onCleanup(@() rmdir(tmp, 's')); %#ok&lt;NASGU&gt;</w:t>
+      </w:r>
+      <w:r>
+        <w:br/>
+      </w:r>
+      <w:r>
+        <w:rPr>
+          <w:rStyle w:val="VerbatimChar"/>
+        </w:rPr>
+        <w:t xml:space="preserve">unzip(docx, tmp);</w:t>
+      </w:r>
+      <w:r>
+        <w:br/>
+      </w:r>
+      <w:r>
+        <w:rPr>
+          <w:rStyle w:val="VerbatimChar"/>
+        </w:rPr>
+        <w:t xml:space="preserve">x = fileread(fullfile(tmp, 'word', 'document.xml'));</w:t>
       </w:r>
       <w:r>
         <w:br/>

</xml_diff>